<commit_message>
Style resume: navy section headers, rules under name and sections
</commit_message>
<xml_diff>
--- a/resume/Shreyas_Bishnu_Resume.docx
+++ b/resume/Shreyas_Bishnu_Resume.docx
@@ -4,42 +4,50 @@
   <w:body>
     <w:p>
       <w:pPr>
-        <w:spacing w:after="60"/>
-        <w:jc w:val="center"/>
-      </w:pPr>
-      <w:r>
-        <w:rPr>
-          <w:rFonts w:ascii="Arial" w:hAnsi="Arial"/>
-          <w:b/>
-          <w:i w:val="0"/>
-          <w:sz w:val="52"/>
-        </w:rPr>
-        <w:t>Shreyas Bishnu</w:t>
-      </w:r>
-    </w:p>
-    <w:p>
-      <w:pPr>
         <w:spacing w:after="40"/>
         <w:jc w:val="center"/>
+        <w:pBdr>
+          <w:bottom w:val="single" w:sz="12" w:space="4" w:color="1F3A5F"/>
+        </w:pBdr>
+      </w:pPr>
+      <w:r>
+        <w:rPr>
+          <w:rFonts w:ascii="Arial" w:hAnsi="Arial"/>
+          <w:b/>
+          <w:i w:val="0"/>
+          <w:color w:val="1F3A5F"/>
+          <w:sz w:val="48"/>
+        </w:rPr>
+        <w:t>Shreyas Bishnu</w:t>
+      </w:r>
+    </w:p>
+    <w:p>
+      <w:pPr>
+        <w:spacing w:after="40"/>
+        <w:jc w:val="center"/>
       </w:pPr>
       <w:r>
         <w:rPr>
           <w:rFonts w:ascii="Arial" w:hAnsi="Arial"/>
           <w:b w:val="0"/>
           <w:i w:val="0"/>
-          <w:sz w:val="18"/>
+          <w:sz w:val="19"/>
         </w:rPr>
         <w:t>League City, TX  |  shreyasvishnu@yahoo.com  |  github.com/ShreyasVishnu  |  shreyasvishnu.github.io/Trial-Web</w:t>
       </w:r>
     </w:p>
     <w:p>
       <w:pPr>
-        <w:spacing w:before="160" w:after="60"/>
-      </w:pPr>
-      <w:r>
-        <w:rPr>
-          <w:rFonts w:ascii="Arial" w:hAnsi="Arial"/>
-          <w:b/>
+        <w:spacing w:before="180" w:after="40"/>
+        <w:pBdr>
+          <w:bottom w:val="single" w:sz="6" w:space="2" w:color="1F3A5F"/>
+        </w:pBdr>
+      </w:pPr>
+      <w:r>
+        <w:rPr>
+          <w:rFonts w:ascii="Arial" w:hAnsi="Arial"/>
+          <w:b/>
+          <w:color w:val="1F3A5F"/>
           <w:sz w:val="22"/>
         </w:rPr>
         <w:t>OBJECTIVE</w:t>
@@ -61,12 +69,16 @@
     </w:p>
     <w:p>
       <w:pPr>
-        <w:spacing w:before="160" w:after="60"/>
-      </w:pPr>
-      <w:r>
-        <w:rPr>
-          <w:rFonts w:ascii="Arial" w:hAnsi="Arial"/>
-          <w:b/>
+        <w:spacing w:before="180" w:after="40"/>
+        <w:pBdr>
+          <w:bottom w:val="single" w:sz="6" w:space="2" w:color="1F3A5F"/>
+        </w:pBdr>
+      </w:pPr>
+      <w:r>
+        <w:rPr>
+          <w:rFonts w:ascii="Arial" w:hAnsi="Arial"/>
+          <w:b/>
+          <w:color w:val="1F3A5F"/>
           <w:sz w:val="22"/>
         </w:rPr>
         <w:t>EDUCATION</w:t>
@@ -77,7 +89,7 @@
         <w:tabs>
           <w:tab w:pos="10512" w:val="right"/>
         </w:tabs>
-        <w:spacing w:before="80" w:after="20"/>
+        <w:spacing w:before="80" w:after="0"/>
       </w:pPr>
       <w:r>
         <w:rPr>
@@ -126,12 +138,16 @@
     </w:p>
     <w:p>
       <w:pPr>
-        <w:spacing w:before="160" w:after="60"/>
-      </w:pPr>
-      <w:r>
-        <w:rPr>
-          <w:rFonts w:ascii="Arial" w:hAnsi="Arial"/>
-          <w:b/>
+        <w:spacing w:before="180" w:after="40"/>
+        <w:pBdr>
+          <w:bottom w:val="single" w:sz="6" w:space="2" w:color="1F3A5F"/>
+        </w:pBdr>
+      </w:pPr>
+      <w:r>
+        <w:rPr>
+          <w:rFonts w:ascii="Arial" w:hAnsi="Arial"/>
+          <w:b/>
+          <w:color w:val="1F3A5F"/>
           <w:sz w:val="22"/>
         </w:rPr>
         <w:t>RESEARCH EXPERIENCE</w:t>
@@ -142,7 +158,7 @@
         <w:tabs>
           <w:tab w:pos="10512" w:val="right"/>
         </w:tabs>
-        <w:spacing w:before="80" w:after="20"/>
+        <w:spacing w:before="80" w:after="0"/>
       </w:pPr>
       <w:r>
         <w:rPr>
@@ -205,7 +221,7 @@
         <w:tabs>
           <w:tab w:pos="10512" w:val="right"/>
         </w:tabs>
-        <w:spacing w:before="80" w:after="20"/>
+        <w:spacing w:before="80" w:after="0"/>
       </w:pPr>
       <w:r>
         <w:rPr>
@@ -265,12 +281,16 @@
     </w:p>
     <w:p>
       <w:pPr>
-        <w:spacing w:before="160" w:after="60"/>
-      </w:pPr>
-      <w:r>
-        <w:rPr>
-          <w:rFonts w:ascii="Arial" w:hAnsi="Arial"/>
-          <w:b/>
+        <w:spacing w:before="180" w:after="40"/>
+        <w:pBdr>
+          <w:bottom w:val="single" w:sz="6" w:space="2" w:color="1F3A5F"/>
+        </w:pBdr>
+      </w:pPr>
+      <w:r>
+        <w:rPr>
+          <w:rFonts w:ascii="Arial" w:hAnsi="Arial"/>
+          <w:b/>
+          <w:color w:val="1F3A5F"/>
           <w:sz w:val="22"/>
         </w:rPr>
         <w:t>VOLUNTEER &amp; COMMUNITY SERVICE</w:t>
@@ -281,7 +301,7 @@
         <w:tabs>
           <w:tab w:pos="10512" w:val="right"/>
         </w:tabs>
-        <w:spacing w:before="80" w:after="20"/>
+        <w:spacing w:before="80" w:after="0"/>
       </w:pPr>
       <w:r>
         <w:rPr>
@@ -305,7 +325,7 @@
         <w:tabs>
           <w:tab w:pos="10512" w:val="right"/>
         </w:tabs>
-        <w:spacing w:before="80" w:after="20"/>
+        <w:spacing w:before="80" w:after="0"/>
       </w:pPr>
       <w:r>
         <w:rPr>
@@ -329,7 +349,7 @@
         <w:tabs>
           <w:tab w:pos="10512" w:val="right"/>
         </w:tabs>
-        <w:spacing w:before="80" w:after="20"/>
+        <w:spacing w:before="80" w:after="0"/>
       </w:pPr>
       <w:r>
         <w:rPr>
@@ -353,7 +373,7 @@
         <w:tabs>
           <w:tab w:pos="10512" w:val="right"/>
         </w:tabs>
-        <w:spacing w:before="80" w:after="20"/>
+        <w:spacing w:before="80" w:after="0"/>
       </w:pPr>
       <w:r>
         <w:rPr>
@@ -377,7 +397,7 @@
         <w:tabs>
           <w:tab w:pos="10512" w:val="right"/>
         </w:tabs>
-        <w:spacing w:before="80" w:after="20"/>
+        <w:spacing w:before="80" w:after="0"/>
       </w:pPr>
       <w:r>
         <w:rPr>
@@ -401,7 +421,7 @@
         <w:tabs>
           <w:tab w:pos="10512" w:val="right"/>
         </w:tabs>
-        <w:spacing w:before="80" w:after="20"/>
+        <w:spacing w:before="80" w:after="0"/>
       </w:pPr>
       <w:r>
         <w:rPr>
@@ -422,12 +442,16 @@
     </w:p>
     <w:p>
       <w:pPr>
-        <w:spacing w:before="160" w:after="60"/>
-      </w:pPr>
-      <w:r>
-        <w:rPr>
-          <w:rFonts w:ascii="Arial" w:hAnsi="Arial"/>
-          <w:b/>
+        <w:spacing w:before="180" w:after="40"/>
+        <w:pBdr>
+          <w:bottom w:val="single" w:sz="6" w:space="2" w:color="1F3A5F"/>
+        </w:pBdr>
+      </w:pPr>
+      <w:r>
+        <w:rPr>
+          <w:rFonts w:ascii="Arial" w:hAnsi="Arial"/>
+          <w:b/>
+          <w:color w:val="1F3A5F"/>
           <w:sz w:val="22"/>
         </w:rPr>
         <w:t>LEADERSHIP EXPERIENCE</w:t>
@@ -438,7 +462,7 @@
         <w:tabs>
           <w:tab w:pos="10512" w:val="right"/>
         </w:tabs>
-        <w:spacing w:before="80" w:after="20"/>
+        <w:spacing w:before="80" w:after="0"/>
       </w:pPr>
       <w:r>
         <w:rPr>
@@ -488,7 +512,7 @@
         <w:tabs>
           <w:tab w:pos="10512" w:val="right"/>
         </w:tabs>
-        <w:spacing w:before="80" w:after="20"/>
+        <w:spacing w:before="80" w:after="0"/>
       </w:pPr>
       <w:r>
         <w:rPr>
@@ -551,7 +575,7 @@
         <w:tabs>
           <w:tab w:pos="10512" w:val="right"/>
         </w:tabs>
-        <w:spacing w:before="80" w:after="20"/>
+        <w:spacing w:before="80" w:after="0"/>
       </w:pPr>
       <w:r>
         <w:rPr>
@@ -611,12 +635,16 @@
     </w:p>
     <w:p>
       <w:pPr>
-        <w:spacing w:before="160" w:after="60"/>
-      </w:pPr>
-      <w:r>
-        <w:rPr>
-          <w:rFonts w:ascii="Arial" w:hAnsi="Arial"/>
-          <w:b/>
+        <w:spacing w:before="180" w:after="40"/>
+        <w:pBdr>
+          <w:bottom w:val="single" w:sz="6" w:space="2" w:color="1F3A5F"/>
+        </w:pBdr>
+      </w:pPr>
+      <w:r>
+        <w:rPr>
+          <w:rFonts w:ascii="Arial" w:hAnsi="Arial"/>
+          <w:b/>
+          <w:color w:val="1F3A5F"/>
           <w:sz w:val="22"/>
         </w:rPr>
         <w:t>EXTRACURRICULAR ACTIVITIES</w:t>
@@ -627,7 +655,7 @@
         <w:tabs>
           <w:tab w:pos="10512" w:val="right"/>
         </w:tabs>
-        <w:spacing w:before="80" w:after="20"/>
+        <w:spacing w:before="80" w:after="0"/>
       </w:pPr>
       <w:r>
         <w:rPr>
@@ -651,7 +679,7 @@
         <w:tabs>
           <w:tab w:pos="10512" w:val="right"/>
         </w:tabs>
-        <w:spacing w:before="80" w:after="20"/>
+        <w:spacing w:before="80" w:after="0"/>
       </w:pPr>
       <w:r>
         <w:rPr>
@@ -675,7 +703,7 @@
         <w:tabs>
           <w:tab w:pos="10512" w:val="right"/>
         </w:tabs>
-        <w:spacing w:before="80" w:after="20"/>
+        <w:spacing w:before="80" w:after="0"/>
       </w:pPr>
       <w:r>
         <w:rPr>
@@ -699,7 +727,7 @@
         <w:tabs>
           <w:tab w:pos="10512" w:val="right"/>
         </w:tabs>
-        <w:spacing w:before="80" w:after="20"/>
+        <w:spacing w:before="80" w:after="0"/>
       </w:pPr>
       <w:r>
         <w:rPr>
@@ -723,7 +751,7 @@
         <w:tabs>
           <w:tab w:pos="10512" w:val="right"/>
         </w:tabs>
-        <w:spacing w:before="80" w:after="20"/>
+        <w:spacing w:before="80" w:after="0"/>
       </w:pPr>
       <w:r>
         <w:rPr>
@@ -747,7 +775,7 @@
         <w:tabs>
           <w:tab w:pos="10512" w:val="right"/>
         </w:tabs>
-        <w:spacing w:before="80" w:after="20"/>
+        <w:spacing w:before="80" w:after="0"/>
       </w:pPr>
       <w:r>
         <w:rPr>
@@ -768,12 +796,16 @@
     </w:p>
     <w:p>
       <w:pPr>
-        <w:spacing w:before="160" w:after="60"/>
-      </w:pPr>
-      <w:r>
-        <w:rPr>
-          <w:rFonts w:ascii="Arial" w:hAnsi="Arial"/>
-          <w:b/>
+        <w:spacing w:before="180" w:after="40"/>
+        <w:pBdr>
+          <w:bottom w:val="single" w:sz="6" w:space="2" w:color="1F3A5F"/>
+        </w:pBdr>
+      </w:pPr>
+      <w:r>
+        <w:rPr>
+          <w:rFonts w:ascii="Arial" w:hAnsi="Arial"/>
+          <w:b/>
+          <w:color w:val="1F3A5F"/>
           <w:sz w:val="22"/>
         </w:rPr>
         <w:t>HONORS &amp; AWARDS</w:t>
@@ -784,7 +816,7 @@
         <w:tabs>
           <w:tab w:pos="10512" w:val="right"/>
         </w:tabs>
-        <w:spacing w:before="80" w:after="20"/>
+        <w:spacing w:before="80" w:after="0"/>
       </w:pPr>
       <w:r>
         <w:rPr>
@@ -808,7 +840,7 @@
         <w:tabs>
           <w:tab w:pos="10512" w:val="right"/>
         </w:tabs>
-        <w:spacing w:before="80" w:after="20"/>
+        <w:spacing w:before="80" w:after="0"/>
       </w:pPr>
       <w:r>
         <w:rPr>
@@ -832,7 +864,7 @@
         <w:tabs>
           <w:tab w:pos="10512" w:val="right"/>
         </w:tabs>
-        <w:spacing w:before="80" w:after="20"/>
+        <w:spacing w:before="80" w:after="0"/>
       </w:pPr>
       <w:r>
         <w:rPr>
@@ -856,7 +888,7 @@
         <w:tabs>
           <w:tab w:pos="10512" w:val="right"/>
         </w:tabs>
-        <w:spacing w:before="80" w:after="20"/>
+        <w:spacing w:before="80" w:after="0"/>
       </w:pPr>
       <w:r>
         <w:rPr>
@@ -880,7 +912,7 @@
         <w:tabs>
           <w:tab w:pos="10512" w:val="right"/>
         </w:tabs>
-        <w:spacing w:before="80" w:after="20"/>
+        <w:spacing w:before="80" w:after="0"/>
       </w:pPr>
       <w:r>
         <w:rPr>
@@ -904,7 +936,7 @@
         <w:tabs>
           <w:tab w:pos="10512" w:val="right"/>
         </w:tabs>
-        <w:spacing w:before="80" w:after="20"/>
+        <w:spacing w:before="80" w:after="0"/>
       </w:pPr>
       <w:r>
         <w:rPr>
@@ -928,7 +960,7 @@
         <w:tabs>
           <w:tab w:pos="10512" w:val="right"/>
         </w:tabs>
-        <w:spacing w:before="80" w:after="20"/>
+        <w:spacing w:before="80" w:after="0"/>
       </w:pPr>
       <w:r>
         <w:rPr>
@@ -952,7 +984,7 @@
         <w:tabs>
           <w:tab w:pos="10512" w:val="right"/>
         </w:tabs>
-        <w:spacing w:before="80" w:after="20"/>
+        <w:spacing w:before="80" w:after="0"/>
       </w:pPr>
       <w:r>
         <w:rPr>
@@ -973,12 +1005,16 @@
     </w:p>
     <w:p>
       <w:pPr>
-        <w:spacing w:before="160" w:after="60"/>
-      </w:pPr>
-      <w:r>
-        <w:rPr>
-          <w:rFonts w:ascii="Arial" w:hAnsi="Arial"/>
-          <w:b/>
+        <w:spacing w:before="180" w:after="40"/>
+        <w:pBdr>
+          <w:bottom w:val="single" w:sz="6" w:space="2" w:color="1F3A5F"/>
+        </w:pBdr>
+      </w:pPr>
+      <w:r>
+        <w:rPr>
+          <w:rFonts w:ascii="Arial" w:hAnsi="Arial"/>
+          <w:b/>
+          <w:color w:val="1F3A5F"/>
           <w:sz w:val="22"/>
         </w:rPr>
         <w:t>SKILLS &amp; CERTIFICATIONS</w:t>
@@ -1056,7 +1092,7 @@
     </w:p>
     <w:sectPr>
       <w:pgSz w:w="12240" w:h="15840"/>
-      <w:pgMar w:top="864" w:right="864" w:bottom="864" w:left="864" w:header="708" w:footer="708" w:gutter="0"/>
+      <w:pgMar w:top="720" w:right="864" w:bottom="720" w:left="864" w:header="708" w:footer="708" w:gutter="0"/>
       <w:cols w:space="720"/>
       <w:docGrid w:linePitch="360"/>
     </w:sectPr>

</xml_diff>

<commit_message>
Fix library spelling (Helen Hall) and add STEM Siblings hours to volunteer section
</commit_message>
<xml_diff>
--- a/resume/Shreyas_Bishnu_Resume.docx
+++ b/resume/Shreyas_Bishnu_Resume.docx
@@ -333,6 +333,30 @@
           <w:b/>
           <w:sz w:val="19"/>
         </w:rPr>
+        <w:t>STEM Siblings Club — After-School STEM Mentor</w:t>
+      </w:r>
+      <w:r>
+        <w:rPr>
+          <w:rFonts w:ascii="Arial" w:hAnsi="Arial"/>
+          <w:sz w:val="19"/>
+        </w:rPr>
+        <w:tab/>
+        <w:t>2024–2026  |  60+ Hours</w:t>
+      </w:r>
+    </w:p>
+    <w:p>
+      <w:pPr>
+        <w:tabs>
+          <w:tab w:pos="10512" w:val="right"/>
+        </w:tabs>
+        <w:spacing w:before="80" w:after="0"/>
+      </w:pPr>
+      <w:r>
+        <w:rPr>
+          <w:rFonts w:ascii="Arial" w:hAnsi="Arial"/>
+          <w:b/>
+          <w:sz w:val="19"/>
+        </w:rPr>
         <w:t>Houston Food Bank — Regular Volunteer</w:t>
       </w:r>
       <w:r>
@@ -381,7 +405,7 @@
           <w:b/>
           <w:sz w:val="19"/>
         </w:rPr>
-        <w:t>Helen Hallel Public Library</w:t>
+        <w:t>Helen Hall Public Library</w:t>
       </w:r>
       <w:r>
         <w:rPr>

</xml_diff>